<commit_message>
Updated aor pythom file
</commit_message>
<xml_diff>
--- a/AOR_PROJECT_Hospital_Network_Design_and_Patient_Allocation Optimization in Delhi NCR.docx
+++ b/AOR_PROJECT_Hospital_Network_Design_and_Patient_Allocation Optimization in Delhi NCR.docx
@@ -4,7 +4,7 @@
   <w:body>
     <w:p>
       <w:pPr>
-        <w:jc w:val="both"/>
+        <w:jc w:val="center"/>
         <w:rPr>
           <w:rFonts w:ascii="Times New Roman" w:hAnsi="Times New Roman" w:cs="Times New Roman"/>
           <w:b/>
@@ -179,7 +179,27 @@
         <w:rPr>
           <w:rFonts w:ascii="Times New Roman" w:hAnsi="Times New Roman" w:cs="Times New Roman"/>
         </w:rPr>
-        <w:t xml:space="preserve">How many additional beds should be added at each selected facility? </w:t>
+        <w:t xml:space="preserve">How many additional beds should be added at selected </w:t>
+      </w:r>
+      <w:proofErr w:type="spellStart"/>
+      <w:r>
+        <w:rPr>
+          <w:rFonts w:ascii="Times New Roman" w:hAnsi="Times New Roman" w:cs="Times New Roman"/>
+        </w:rPr>
+        <w:t>facilit</w:t>
+      </w:r>
+      <w:r>
+        <w:rPr>
+          <w:rFonts w:ascii="Times New Roman" w:hAnsi="Times New Roman" w:cs="Times New Roman"/>
+        </w:rPr>
+        <w:t>es</w:t>
+      </w:r>
+      <w:proofErr w:type="spellEnd"/>
+      <w:r>
+        <w:rPr>
+          <w:rFonts w:ascii="Times New Roman" w:hAnsi="Times New Roman" w:cs="Times New Roman"/>
+        </w:rPr>
+        <w:t xml:space="preserve">? </w:t>
       </w:r>
     </w:p>
     <w:p>
@@ -197,42 +217,6 @@
         <w:rPr>
           <w:rFonts w:ascii="Times New Roman" w:hAnsi="Times New Roman" w:cs="Times New Roman"/>
         </w:rPr>
-        <w:t xml:space="preserve">Should some hospitals be designated as referral hubs for specific regions? </w:t>
-      </w:r>
-    </w:p>
-    <w:p>
-      <w:pPr>
-        <w:numPr>
-          <w:ilvl w:val="0"/>
-          <w:numId w:val="1"/>
-        </w:numPr>
-        <w:jc w:val="both"/>
-        <w:rPr>
-          <w:rFonts w:ascii="Times New Roman" w:hAnsi="Times New Roman" w:cs="Times New Roman"/>
-        </w:rPr>
-      </w:pPr>
-      <w:r>
-        <w:rPr>
-          <w:rFonts w:ascii="Times New Roman" w:hAnsi="Times New Roman" w:cs="Times New Roman"/>
-        </w:rPr>
-        <w:t xml:space="preserve">How should limited capital expenditure be allocated across multiple facilities? </w:t>
-      </w:r>
-    </w:p>
-    <w:p>
-      <w:pPr>
-        <w:numPr>
-          <w:ilvl w:val="0"/>
-          <w:numId w:val="1"/>
-        </w:numPr>
-        <w:jc w:val="both"/>
-        <w:rPr>
-          <w:rFonts w:ascii="Times New Roman" w:hAnsi="Times New Roman" w:cs="Times New Roman"/>
-        </w:rPr>
-      </w:pPr>
-      <w:r>
-        <w:rPr>
-          <w:rFonts w:ascii="Times New Roman" w:hAnsi="Times New Roman" w:cs="Times New Roman"/>
-        </w:rPr>
         <w:t xml:space="preserve">Which demand zones should be served by which hospitals after network redesign? </w:t>
       </w:r>
     </w:p>
@@ -281,7 +265,6 @@
           <w:b/>
           <w:bCs/>
         </w:rPr>
-        <w:lastRenderedPageBreak/>
         <w:t>Overcrowding at major hospitals</w:t>
       </w:r>
       <w:r>
@@ -308,6 +291,7 @@
           <w:b/>
           <w:bCs/>
         </w:rPr>
+        <w:lastRenderedPageBreak/>
         <w:t>Long patient travel times</w:t>
       </w:r>
       <w:r>
@@ -636,103 +620,6 @@
         <w:jc w:val="both"/>
         <w:rPr>
           <w:rFonts w:ascii="Times New Roman" w:hAnsi="Times New Roman" w:cs="Times New Roman"/>
-          <w:b/>
-          <w:bCs/>
-        </w:rPr>
-      </w:pPr>
-      <w:r>
-        <w:rPr>
-          <w:rFonts w:ascii="Times New Roman" w:hAnsi="Times New Roman" w:cs="Times New Roman"/>
-          <w:b/>
-          <w:bCs/>
-        </w:rPr>
-        <w:t>Logical Constraints</w:t>
-      </w:r>
-    </w:p>
-    <w:p>
-      <w:pPr>
-        <w:jc w:val="both"/>
-        <w:rPr>
-          <w:rFonts w:ascii="Times New Roman" w:hAnsi="Times New Roman" w:cs="Times New Roman"/>
-        </w:rPr>
-      </w:pPr>
-      <w:r>
-        <w:rPr>
-          <w:rFonts w:ascii="Times New Roman" w:hAnsi="Times New Roman" w:cs="Times New Roman"/>
-        </w:rPr>
-        <w:t>Beds can only be added to facilities selected for expansion or eligible for upgrade.</w:t>
-      </w:r>
-    </w:p>
-    <w:p>
-      <w:pPr>
-        <w:jc w:val="both"/>
-        <w:rPr>
-          <w:rFonts w:ascii="Times New Roman" w:hAnsi="Times New Roman" w:cs="Times New Roman"/>
-          <w:b/>
-          <w:bCs/>
-        </w:rPr>
-      </w:pPr>
-      <w:r>
-        <w:rPr>
-          <w:rFonts w:ascii="Times New Roman" w:hAnsi="Times New Roman" w:cs="Times New Roman"/>
-          <w:b/>
-          <w:bCs/>
-        </w:rPr>
-        <w:t>Accessibility Constraints</w:t>
-      </w:r>
-    </w:p>
-    <w:p>
-      <w:pPr>
-        <w:jc w:val="both"/>
-        <w:rPr>
-          <w:rFonts w:ascii="Times New Roman" w:hAnsi="Times New Roman" w:cs="Times New Roman"/>
-        </w:rPr>
-      </w:pPr>
-      <w:r>
-        <w:rPr>
-          <w:rFonts w:ascii="Times New Roman" w:hAnsi="Times New Roman" w:cs="Times New Roman"/>
-        </w:rPr>
-        <w:lastRenderedPageBreak/>
-        <w:t>Some patient zones may require maximum travel time thresholds, especially for emergency or essential services.</w:t>
-      </w:r>
-    </w:p>
-    <w:p>
-      <w:pPr>
-        <w:jc w:val="both"/>
-        <w:rPr>
-          <w:rFonts w:ascii="Times New Roman" w:hAnsi="Times New Roman" w:cs="Times New Roman"/>
-          <w:b/>
-          <w:bCs/>
-        </w:rPr>
-      </w:pPr>
-      <w:r>
-        <w:rPr>
-          <w:rFonts w:ascii="Times New Roman" w:hAnsi="Times New Roman" w:cs="Times New Roman"/>
-          <w:b/>
-          <w:bCs/>
-        </w:rPr>
-        <w:t>Policy Constraints</w:t>
-      </w:r>
-    </w:p>
-    <w:p>
-      <w:pPr>
-        <w:jc w:val="both"/>
-        <w:rPr>
-          <w:rFonts w:ascii="Times New Roman" w:hAnsi="Times New Roman" w:cs="Times New Roman"/>
-        </w:rPr>
-      </w:pPr>
-      <w:r>
-        <w:rPr>
-          <w:rFonts w:ascii="Times New Roman" w:hAnsi="Times New Roman" w:cs="Times New Roman"/>
-        </w:rPr>
-        <w:t>Authorities may require minimum service availability in specific districts or equitable regional coverage.</w:t>
-      </w:r>
-    </w:p>
-    <w:p>
-      <w:pPr>
-        <w:jc w:val="both"/>
-        <w:rPr>
-          <w:rFonts w:ascii="Times New Roman" w:hAnsi="Times New Roman" w:cs="Times New Roman"/>
         </w:rPr>
       </w:pPr>
       <w:r>
@@ -771,6 +658,7 @@
         <w:rPr>
           <w:rFonts w:ascii="Times New Roman" w:hAnsi="Times New Roman" w:cs="Times New Roman"/>
         </w:rPr>
+        <w:lastRenderedPageBreak/>
         <w:t xml:space="preserve">Where should new capacity be created? </w:t>
       </w:r>
     </w:p>
@@ -825,7 +713,7 @@
         <w:rPr>
           <w:rFonts w:ascii="Times New Roman" w:hAnsi="Times New Roman" w:cs="Times New Roman"/>
         </w:rPr>
-        <w:t xml:space="preserve">How can congestion be reduced at tertiary </w:t>
+        <w:t xml:space="preserve">How can congestion be reduced at </w:t>
       </w:r>
       <w:proofErr w:type="spellStart"/>
       <w:r>
@@ -2090,6 +1978,7 @@
   <w:style w:type="character" w:default="1" w:styleId="DefaultParagraphFont">
     <w:name w:val="Default Paragraph Font"/>
     <w:uiPriority w:val="1"/>
+    <w:semiHidden/>
     <w:unhideWhenUsed/>
   </w:style>
   <w:style w:type="table" w:default="1" w:styleId="TableNormal">
@@ -2719,4 +2608,24 @@
     </a:ext>
   </a:extLst>
 </a:theme>
+</file>
+
+<file path=word/webextensions/taskpanes.xml><?xml version="1.0" encoding="utf-8"?>
+<wetp:taskpanes xmlns:wetp="http://schemas.microsoft.com/office/webextensions/taskpanes/2010/11">
+  <wetp:taskpane dockstate="right" visibility="0" width="438" row="2">
+    <wetp:webextensionref xmlns:r="http://schemas.openxmlformats.org/officeDocument/2006/relationships" r:id="rId1"/>
+  </wetp:taskpane>
+</wetp:taskpanes>
+</file>
+
+<file path=word/webextensions/webextension1.xml><?xml version="1.0" encoding="utf-8"?>
+<we:webextension xmlns:we="http://schemas.microsoft.com/office/webextensions/webextension/2010/11" id="{281A5B2E-9EE7-44C2-8BC0-833EBF74D4AF}">
+  <we:reference id="f12c312d-282a-4734-8843-05915fdfef0b" version="4.3.3.0" store="EXCatalog" storeType="EXCatalog"/>
+  <we:alternateReferences>
+    <we:reference id="WA104178141" version="4.3.3.0" store="en-US" storeType="OMEX"/>
+  </we:alternateReferences>
+  <we:properties/>
+  <we:bindings/>
+  <we:snapshot xmlns:r="http://schemas.openxmlformats.org/officeDocument/2006/relationships"/>
+</we:webextension>
 </file>
</xml_diff>